<commit_message>
Remove the "Optional descriptor" placeholder from the docx cover header
Co-Authored-By: Claude Opus 5.5 <noreply@anthropic.com>
</commit_message>
<xml_diff>
--- a/Qlik-OLH-Deployment-Instructions.docx
+++ b/Qlik-OLH-Deployment-Instructions.docx
@@ -8316,20 +8316,6 @@
         <w:szCs w:val="28"/>
       </w:rPr>
     </w:pPr>
-    <w:r>
-      <w:rPr>
-        <w:sz w:val="28"/>
-        <w:szCs w:val="28"/>
-      </w:rPr>
-      <w:t xml:space="preserve">Optional </w:t>
-    </w:r>
-    <w:r>
-      <w:rPr>
-        <w:sz w:val="28"/>
-        <w:szCs w:val="28"/>
-      </w:rPr>
-      <w:t>descriptor</w:t>
-    </w:r>
   </w:p>
 </w:hdr>
 </file>

</xml_diff>